<commit_message>
feat: BAHP header logo mitra + suggestName sesuai template filename
BA_PENGUJIAN.docx header:
- Hapus static logo PT Gatra Hita Wasana (anchor kiri)
- {%logoMitra} dipindah ke paragraf pertama header (kiri atas)
  sehingga logo pihak kedua yang di-upload muncul top-left

suggestName (sesuai pola TEMPLATE_[NAMA]_[FORMAT]):
- SURAT_TUGAS: Surat_Tugas_{nomor} → {nama1}
- BAI: BAI_{noPA} → Surat_BAI_{noPA}
- BA_PENGUJIAN: BA_Pengujian_{nomor/instansi} → BAHP_{instansiPihakPertama}
- BAST: BAST_{nomor} → BAST_{perangkat}
BAKL, BAP, NODIN sudah benar, tidak diubah.

Co-Authored-By: Claude Sonnet 4.6 <noreply@anthropic.com>
</commit_message>
<xml_diff>
--- a/templates/docx/BA_PENGUJIAN.docx
+++ b/templates/docx/BA_PENGUJIAN.docx
@@ -1997,6 +1997,14 @@
 
 <file path=word/header1.xml><?xml version="1.0" encoding="utf-8"?>
 <w:hdr xmlns:mc="http://schemas.openxmlformats.org/markup-compatibility/2006" xmlns:o="urn:schemas-microsoft-com:office:office" xmlns:r="http://schemas.openxmlformats.org/officeDocument/2006/relationships" xmlns:m="http://schemas.openxmlformats.org/officeDocument/2006/math" xmlns:v="urn:schemas-microsoft-com:vml" xmlns:wp="http://schemas.openxmlformats.org/drawingml/2006/wordprocessingDrawing" xmlns:w10="urn:schemas-microsoft-com:office:word" xmlns:w="http://schemas.openxmlformats.org/wordprocessingml/2006/main" xmlns:wne="http://schemas.microsoft.com/office/word/2006/wordml" xmlns:sl="http://schemas.openxmlformats.org/schemaLibrary/2006/main" xmlns:a="http://schemas.openxmlformats.org/drawingml/2006/main" xmlns:pic="http://schemas.openxmlformats.org/drawingml/2006/picture" xmlns:c="http://schemas.openxmlformats.org/drawingml/2006/chart" xmlns:lc="http://schemas.openxmlformats.org/drawingml/2006/lockedCanvas" xmlns:dgm="http://schemas.openxmlformats.org/drawingml/2006/diagram" xmlns:wps="http://schemas.microsoft.com/office/word/2010/wordprocessingShape" xmlns:wpg="http://schemas.microsoft.com/office/word/2010/wordprocessingGroup" xmlns:w14="http://schemas.microsoft.com/office/word/2010/wordml" xmlns:w15="http://schemas.microsoft.com/office/word/2012/wordml" xmlns:w16="http://schemas.microsoft.com/office/word/2018/wordml" xmlns:w16cex="http://schemas.microsoft.com/office/word/2018/wordml/cex" xmlns:w16cid="http://schemas.microsoft.com/office/word/2016/wordml/cid" xmlns="http://schemas.microsoft.com/office/tasks/2019/documenttasks" xmlns:cr="http://schemas.microsoft.com/office/comments/2020/reactions">
+  <w:p>
+    <w:pPr>
+      <w:jc w:val="left"/>
+    </w:pPr>
+    <w:r>
+      <w:t>{%logoMitra}</w:t>
+    </w:r>
+  </w:p>
   <w:p>
     <w:pPr>
       <w:tabs>
@@ -2068,48 +2076,6 @@
         </wp:anchor>
       </w:drawing>
     </w:r>
-    <w:r>
-      <w:drawing>
-        <wp:anchor allowOverlap="1" behindDoc="1" distB="114300" distT="114300" distL="114300" distR="114300" hidden="0" layoutInCell="1" locked="0" relativeHeight="0" simplePos="0">
-          <wp:simplePos x="0" y="0"/>
-          <wp:positionH relativeFrom="column">
-            <wp:posOffset>-638174</wp:posOffset>
-          </wp:positionH>
-          <wp:positionV relativeFrom="paragraph">
-            <wp:posOffset>-228599</wp:posOffset>
-          </wp:positionV>
-          <wp:extent cx="1737030" cy="519113"/>
-          <wp:effectExtent b="0" l="0" r="0" t="0"/>
-          <wp:wrapNone/>
-          <wp:docPr id="1" name="image2.png"/>
-          <a:graphic>
-            <a:graphicData uri="http://schemas.openxmlformats.org/drawingml/2006/picture">
-              <pic:pic>
-                <pic:nvPicPr>
-                  <pic:cNvPr id="0" name="image2.png"/>
-                  <pic:cNvPicPr preferRelativeResize="0"/>
-                </pic:nvPicPr>
-                <pic:blipFill>
-                  <a:blip r:embed="rId2"/>
-                  <a:srcRect b="0" l="0" r="0" t="0"/>
-                  <a:stretch>
-                    <a:fillRect/>
-                  </a:stretch>
-                </pic:blipFill>
-                <pic:spPr>
-                  <a:xfrm>
-                    <a:off x="0" y="0"/>
-                    <a:ext cx="1737030" cy="519113"/>
-                  </a:xfrm>
-                  <a:prstGeom prst="rect"/>
-                  <a:ln/>
-                </pic:spPr>
-              </pic:pic>
-            </a:graphicData>
-          </a:graphic>
-        </wp:anchor>
-      </w:drawing>
-    </w:r>
   </w:p>
   <w:p>
     <w:pPr>
@@ -2166,11 +2132,6 @@
       <w:rPr>
         <w:rtl w:val="0"/>
       </w:rPr>
-    </w:r>
-  </w:p>
-  <w:p>
-    <w:r>
-      <w:t>{%logoMitra}</w:t>
     </w:r>
   </w:p>
 </w:hdr>

</xml_diff>